<commit_message>
Added output screenshot for Singleton Pattern
</commit_message>
<xml_diff>
--- a/03-Advanced-SQL/CreateStoredProcedure/Stored Procedure Exercise 1.docx
+++ b/03-Advanced-SQL/CreateStoredProcedure/Stored Procedure Exercise 1.docx
@@ -1195,6 +1195,14 @@
           </wp:inline>
         </w:drawing>
       </w:r>
+    </w:p>
+    <w:p>
+      <w:pPr>
+        <w:rPr>
+          <w:sz w:val="32"/>
+          <w:szCs w:val="32"/>
+        </w:rPr>
+      </w:pPr>
     </w:p>
     <w:sectPr>
       <w:pgSz w:w="11906" w:h="16838"/>

</xml_diff>